<commit_message>
feat: declaratoria desierto, fix decimal overflow y fix lista cotejo SI/NO
- Agregar endpoint PATCH /expedientes/:id/declarar-desierto (Art. 113 LCP)
- Agregar campos declaratoriaDesierto, causal y justificación al schema
- Agregar valor DESIERTO al enum EstatusProceso
- Ampliar columnas monetarias de DECIMAL(15,2) a DECIMAL(18,4)
- Eliminar endpoint POST /calcular-modalidad (lógica movida al frontend)
- Fix lista de cotejo: separar placeholders SI/NO en columnas independientes

Co-Authored-By: Claude Opus 4.6 <noreply@anthropic.com>
</commit_message>
<xml_diff>
--- a/src/generador-documentos/templates/lista-cotejo-template.docx
+++ b/src/generador-documentos/templates/lista-cotejo-template.docx
@@ -716,7 +716,7 @@
               <w:t>carta_manifestacion_voluntad</w:t>
             </w:r>
             <w:r>
-              <w:t>_au_au</w:t>
+              <w:t>_au_au_si</w:t>
             </w:r>
             <w:proofErr w:type="spellEnd"/>
             <w:r>
@@ -765,7 +765,7 @@
               <w:t>carta_manifestacion_voluntad</w:t>
             </w:r>
             <w:r>
-              <w:t>_au_au</w:t>
+              <w:t>_au_au_no</w:t>
             </w:r>
             <w:proofErr w:type="spellEnd"/>
             <w:r>
@@ -918,7 +918,7 @@
               <w:t>carta_autorizacion</w:t>
             </w:r>
             <w:r>
-              <w:t>_au_au</w:t>
+              <w:t>_au_au_si</w:t>
             </w:r>
             <w:proofErr w:type="spellEnd"/>
             <w:r>
@@ -967,7 +967,7 @@
               <w:t>carta_autorizacion</w:t>
             </w:r>
             <w:r>
-              <w:t>_au_au</w:t>
+              <w:t>_au_au_no</w:t>
             </w:r>
             <w:proofErr w:type="spellEnd"/>
             <w:r>
@@ -1100,7 +1100,7 @@
               <w:t>copia_rif_vigente</w:t>
             </w:r>
             <w:r>
-              <w:t>_au_au</w:t>
+              <w:t>_au_au_si</w:t>
             </w:r>
             <w:proofErr w:type="spellEnd"/>
             <w:r>
@@ -1149,7 +1149,7 @@
               <w:t>copia_rif_vigente</w:t>
             </w:r>
             <w:r>
-              <w:t>_au_au</w:t>
+              <w:t>_au_au_no</w:t>
             </w:r>
             <w:proofErr w:type="spellEnd"/>
             <w:r>
@@ -1283,7 +1283,7 @@
               <w:t>certificado_rnc</w:t>
             </w:r>
             <w:r>
-              <w:t>_au_au</w:t>
+              <w:t>_au_au_si</w:t>
             </w:r>
             <w:proofErr w:type="spellEnd"/>
             <w:r>
@@ -1332,7 +1332,7 @@
               <w:t>certificado_rnc</w:t>
             </w:r>
             <w:r>
-              <w:t>_au_au</w:t>
+              <w:t>_au_au_no</w:t>
             </w:r>
             <w:proofErr w:type="spellEnd"/>
             <w:r>
@@ -1485,7 +1485,7 @@
               <w:t>solvencia_laboral</w:t>
             </w:r>
             <w:r>
-              <w:t>_au_au</w:t>
+              <w:t>_au_au_si</w:t>
             </w:r>
             <w:proofErr w:type="spellEnd"/>
             <w:r>
@@ -1534,7 +1534,7 @@
               <w:t>solvencia_laboral</w:t>
             </w:r>
             <w:r>
-              <w:t>_au_au</w:t>
+              <w:t>_au_au_no</w:t>
             </w:r>
             <w:proofErr w:type="spellEnd"/>
             <w:r>
@@ -1687,7 +1687,7 @@
               <w:t>declaracion_socios_no_inhabilitados</w:t>
             </w:r>
             <w:r>
-              <w:t>_au_au</w:t>
+              <w:t>_au_au_si</w:t>
             </w:r>
             <w:proofErr w:type="spellEnd"/>
             <w:r>
@@ -1736,7 +1736,7 @@
               <w:t>declaracion_socios_no_inhabilitados</w:t>
             </w:r>
             <w:r>
-              <w:t>_au_au</w:t>
+              <w:t>_au_au_no</w:t>
             </w:r>
             <w:proofErr w:type="spellEnd"/>
             <w:r>
@@ -1889,7 +1889,7 @@
               <w:t>declaracion_no_deudas_ente</w:t>
             </w:r>
             <w:r>
-              <w:t>_au_au</w:t>
+              <w:t>_au_au_si</w:t>
             </w:r>
             <w:proofErr w:type="spellEnd"/>
             <w:r>
@@ -1938,7 +1938,7 @@
               <w:t>declaracion_no_deudas_ente</w:t>
             </w:r>
             <w:r>
-              <w:t>_au_au</w:t>
+              <w:t>_au_au_no</w:t>
             </w:r>
             <w:proofErr w:type="spellEnd"/>
             <w:r>
@@ -2091,7 +2091,7 @@
               <w:t>declaracion_no_impedimentos_lcp</w:t>
             </w:r>
             <w:r>
-              <w:t>_au_au</w:t>
+              <w:t>_au_au_si</w:t>
             </w:r>
             <w:proofErr w:type="spellEnd"/>
             <w:r>
@@ -2140,7 +2140,7 @@
               <w:t>declaracion_no_impedimentos_lcp</w:t>
             </w:r>
             <w:r>
-              <w:t>_au_au</w:t>
+              <w:t>_au_au_no</w:t>
             </w:r>
             <w:proofErr w:type="spellEnd"/>
             <w:r>
@@ -2294,7 +2294,7 @@
               <w:t>declaracion_info_financiera</w:t>
             </w:r>
             <w:r>
-              <w:t>_au_au</w:t>
+              <w:t>_au_au_si</w:t>
             </w:r>
             <w:proofErr w:type="spellEnd"/>
             <w:r>
@@ -2343,7 +2343,7 @@
               <w:t>declaracion_info_financiera</w:t>
             </w:r>
             <w:r>
-              <w:t>_au_au</w:t>
+              <w:t>_au_au_no</w:t>
             </w:r>
             <w:proofErr w:type="spellEnd"/>
             <w:r>
@@ -2496,7 +2496,7 @@
               <w:t>relacion_servicios_prestados</w:t>
             </w:r>
             <w:r>
-              <w:t>_au_au</w:t>
+              <w:t>_au_au_si</w:t>
             </w:r>
             <w:proofErr w:type="spellEnd"/>
             <w:r>
@@ -2545,7 +2545,7 @@
               <w:t>relacion_servicios_prestados</w:t>
             </w:r>
             <w:r>
-              <w:t>_au_au</w:t>
+              <w:t>_au_au_no</w:t>
             </w:r>
             <w:proofErr w:type="spellEnd"/>
             <w:r>
@@ -2678,7 +2678,7 @@
               <w:t>referencias_comerciales</w:t>
             </w:r>
             <w:r>
-              <w:t>_au_au</w:t>
+              <w:t>_au_au_si</w:t>
             </w:r>
             <w:proofErr w:type="spellEnd"/>
             <w:r>
@@ -2727,7 +2727,7 @@
               <w:t>referencias_comerciales</w:t>
             </w:r>
             <w:r>
-              <w:t>_au_au</w:t>
+              <w:t>_au_au_no</w:t>
             </w:r>
             <w:proofErr w:type="spellEnd"/>
             <w:r>
@@ -4262,7 +4262,7 @@
                 <w:sz w:val="20"/>
                 <w:szCs w:val="20"/>
               </w:rPr>
-              <w:t>oferta_tecnico_economica_au_au</w:t>
+              <w:t>oferta_tecnico_economica_au_au_si</w:t>
             </w:r>
             <w:proofErr w:type="spellEnd"/>
             <w:r>
@@ -4315,7 +4315,7 @@
                 <w:sz w:val="20"/>
                 <w:szCs w:val="20"/>
               </w:rPr>
-              <w:t>_au_au</w:t>
+              <w:t>_au_au_no</w:t>
             </w:r>
             <w:proofErr w:type="spellEnd"/>
             <w:r>
@@ -4476,7 +4476,7 @@
                 <w:sz w:val="20"/>
                 <w:szCs w:val="20"/>
               </w:rPr>
-              <w:t>_au_au</w:t>
+              <w:t>_au_au_si</w:t>
             </w:r>
             <w:proofErr w:type="spellEnd"/>
             <w:r>
@@ -4529,7 +4529,7 @@
                 <w:sz w:val="20"/>
                 <w:szCs w:val="20"/>
               </w:rPr>
-              <w:t>_au_au</w:t>
+              <w:t>_au_au_no</w:t>
             </w:r>
             <w:proofErr w:type="spellEnd"/>
             <w:r>
@@ -4689,7 +4689,7 @@
                 <w:sz w:val="20"/>
                 <w:szCs w:val="20"/>
               </w:rPr>
-              <w:t>_au_au</w:t>
+              <w:t>_au_au_si</w:t>
             </w:r>
             <w:proofErr w:type="spellEnd"/>
             <w:r>
@@ -4742,7 +4742,7 @@
                 <w:sz w:val="20"/>
                 <w:szCs w:val="20"/>
               </w:rPr>
-              <w:t>_au_au</w:t>
+              <w:t>_au_au_no</w:t>
             </w:r>
             <w:proofErr w:type="spellEnd"/>
             <w:r>
@@ -4912,7 +4912,7 @@
                 <w:sz w:val="20"/>
                 <w:szCs w:val="20"/>
               </w:rPr>
-              <w:t>_au_au</w:t>
+              <w:t>_au_au_si</w:t>
             </w:r>
             <w:proofErr w:type="spellEnd"/>
             <w:r>
@@ -4976,7 +4976,7 @@
                 <w:sz w:val="20"/>
                 <w:szCs w:val="20"/>
               </w:rPr>
-              <w:t>_au_au</w:t>
+              <w:t>_au_au_no</w:t>
             </w:r>
             <w:proofErr w:type="spellEnd"/>
             <w:r>
@@ -5146,7 +5146,7 @@
                 <w:sz w:val="20"/>
                 <w:szCs w:val="20"/>
               </w:rPr>
-              <w:t>_au_au</w:t>
+              <w:t>_au_au_si</w:t>
             </w:r>
             <w:proofErr w:type="spellEnd"/>
             <w:r>
@@ -5199,7 +5199,7 @@
                 <w:sz w:val="20"/>
                 <w:szCs w:val="20"/>
               </w:rPr>
-              <w:t>_au_au</w:t>
+              <w:t>_au_au_no</w:t>
             </w:r>
             <w:proofErr w:type="spellEnd"/>
             <w:r>
@@ -5359,7 +5359,7 @@
                 <w:sz w:val="20"/>
                 <w:szCs w:val="20"/>
               </w:rPr>
-              <w:t>_au_au</w:t>
+              <w:t>_au_au_si</w:t>
             </w:r>
             <w:proofErr w:type="spellEnd"/>
             <w:r>
@@ -5412,7 +5412,7 @@
                 <w:sz w:val="20"/>
                 <w:szCs w:val="20"/>
               </w:rPr>
-              <w:t>_au_au</w:t>
+              <w:t>_au_au_no</w:t>
             </w:r>
             <w:proofErr w:type="spellEnd"/>
             <w:r>

</xml_diff>